<commit_message>
feat: added priceTotal to BookingConfirmation
</commit_message>
<xml_diff>
--- a/Relazione Progetto.docx
+++ b/Relazione Progetto.docx
@@ -97,6 +97,14 @@
     </w:p>
     <w:sdt>
       <w:sdtPr>
+        <w:rPr>
+          <w:rFonts w:asciiTheme="minorHAnsi" w:eastAsiaTheme="minorEastAsia" w:hAnsiTheme="minorHAnsi" w:cstheme="minorBidi"/>
+          <w:color w:val="auto"/>
+          <w:kern w:val="2"/>
+          <w:sz w:val="24"/>
+          <w:szCs w:val="24"/>
+          <w14:ligatures w14:val="standardContextual"/>
+        </w:rPr>
         <w:id w:val="-1709481725"/>
         <w:docPartObj>
           <w:docPartGallery w:val="Table of Contents"/>
@@ -105,14 +113,8 @@
       </w:sdtPr>
       <w:sdtEndPr>
         <w:rPr>
-          <w:rFonts w:asciiTheme="minorHAnsi" w:eastAsiaTheme="minorEastAsia" w:hAnsiTheme="minorHAnsi" w:cstheme="minorBidi"/>
           <w:b/>
           <w:bCs/>
-          <w:color w:val="auto"/>
-          <w:kern w:val="2"/>
-          <w:sz w:val="24"/>
-          <w:szCs w:val="24"/>
-          <w14:ligatures w14:val="standardContextual"/>
         </w:rPr>
       </w:sdtEndPr>
       <w:sdtContent>
@@ -1241,16 +1243,30 @@
     <w:p>
       <w:pPr>
         <w:pStyle w:val="Titolo1"/>
+        <w:rPr>
+          <w:lang w:val="en-US"/>
+        </w:rPr>
       </w:pPr>
       <w:bookmarkStart w:id="0" w:name="_Toc231639387"/>
       <w:r>
+        <w:rPr>
+          <w:lang w:val="en-US"/>
+        </w:rPr>
         <w:lastRenderedPageBreak/>
         <w:t>Repository Git (GitHub)</w:t>
       </w:r>
       <w:bookmarkEnd w:id="0"/>
     </w:p>
     <w:p>
-      <w:r>
+      <w:pPr>
+        <w:rPr>
+          <w:lang w:val="en-US"/>
+        </w:rPr>
+      </w:pPr>
+      <w:r>
+        <w:rPr>
+          <w:lang w:val="en-US"/>
+        </w:rPr>
         <w:t>https://github.com/StatJon/Progetto-IngegneriaSistemiWeb.git</w:t>
       </w:r>
     </w:p>
@@ -1301,7 +1317,15 @@
     </w:p>
     <w:p>
       <w:r>
-        <w:t>In tutte le pagine, nella navbar, l’ultima opzione è un pulsante / link che varia in base all’identità dell’utente per permettere di accedere alla pagina relativa ad esso più coerente.</w:t>
+        <w:t xml:space="preserve">In tutte le pagine, nella </w:t>
+      </w:r>
+      <w:proofErr w:type="spellStart"/>
+      <w:r>
+        <w:t>navbar</w:t>
+      </w:r>
+      <w:proofErr w:type="spellEnd"/>
+      <w:r>
+        <w:t>, l’ultima opzione è un pulsante / link che varia in base all’identità dell’utente per permettere di accedere alla pagina relativa ad esso più coerente.</w:t>
       </w:r>
       <w:r>
         <w:br/>
@@ -1315,13 +1339,9 @@
           <w:color w:val="0F4761" w:themeColor="accent1" w:themeShade="BF"/>
           <w:sz w:val="40"/>
           <w:szCs w:val="40"/>
-          <w:lang w:val="en-US"/>
-        </w:rPr>
-      </w:pPr>
-      <w:r>
-        <w:rPr>
-          <w:lang w:val="en-US"/>
-        </w:rPr>
+        </w:rPr>
+      </w:pPr>
+      <w:r>
         <w:br w:type="page"/>
       </w:r>
     </w:p>
@@ -1364,7 +1384,15 @@
         <w:t xml:space="preserve"> il tipo di veicolo da sottoporre a manutenzione (auto o moto) tramite gli appositi bottoni</w:t>
       </w:r>
       <w:r>
-        <w:t xml:space="preserve"> in navbar ed homepage</w:t>
+        <w:t xml:space="preserve"> in </w:t>
+      </w:r>
+      <w:proofErr w:type="spellStart"/>
+      <w:r>
+        <w:t>navbar</w:t>
+      </w:r>
+      <w:proofErr w:type="spellEnd"/>
+      <w:r>
+        <w:t xml:space="preserve"> ed homepage</w:t>
       </w:r>
       <w:r>
         <w:t>.</w:t>
@@ -1372,19 +1400,7 @@
     </w:p>
     <w:p>
       <w:r>
-        <w:t>Successivamente è necessario scegliere</w:t>
-      </w:r>
-      <w:r>
-        <w:t xml:space="preserve"> quali servizi effettuare</w:t>
-      </w:r>
-      <w:r>
-        <w:t xml:space="preserve"> ed infine inserire i dettagli del veicolo e decidere</w:t>
-      </w:r>
-      <w:r>
-        <w:t xml:space="preserve"> la data e l’ora dell’appuntamento</w:t>
-      </w:r>
-      <w:r>
-        <w:t>.</w:t>
+        <w:t>Successivamente è necessario scegliere quali servizi effettuare ed infine inserire i dettagli del veicolo e decidere la data e l’ora dell’appuntamento, vengono mostrati i giorni e gli orari disponibili in base alla disponibilità di meccanici a quell’ora-giorno.</w:t>
       </w:r>
     </w:p>
     <w:p>
@@ -1433,7 +1449,15 @@
         <w:t>Una volta acceduti, la dashboard presenta tutti i lavori</w:t>
       </w:r>
       <w:r>
-        <w:t xml:space="preserve"> assegnati al dipendente. La dashboard permette, oltre a visionare i propri lavori, di modificare lo stato dei lavori selezionando la riga lavoro interessata (tramite radio button) e premendo su uno dei tasti azione a sinistra.</w:t>
+        <w:t xml:space="preserve"> assegnati al dipendente. La dashboard permette, oltre a visionare i propri lavori, di modificare lo stato dei lavori selezionando la riga lavoro interessata (tramite radio </w:t>
+      </w:r>
+      <w:proofErr w:type="spellStart"/>
+      <w:r>
+        <w:t>button</w:t>
+      </w:r>
+      <w:proofErr w:type="spellEnd"/>
+      <w:r>
+        <w:t>) e premendo su uno dei tasti azione a sinistra.</w:t>
       </w:r>
     </w:p>
     <w:p>
@@ -1495,7 +1519,15 @@
         </w:numPr>
       </w:pPr>
       <w:r>
-        <w:t>XAMPP (Apache, MySql)</w:t>
+        <w:t xml:space="preserve">XAMPP (Apache, </w:t>
+      </w:r>
+      <w:proofErr w:type="spellStart"/>
+      <w:r>
+        <w:t>MySql</w:t>
+      </w:r>
+      <w:proofErr w:type="spellEnd"/>
+      <w:r>
+        <w:t>)</w:t>
       </w:r>
     </w:p>
     <w:p>
@@ -1518,12 +1550,14 @@
           <w:numId w:val="1"/>
         </w:numPr>
       </w:pPr>
+      <w:proofErr w:type="spellStart"/>
       <w:r>
         <w:t>n</w:t>
       </w:r>
       <w:r>
         <w:t>pm</w:t>
       </w:r>
+      <w:proofErr w:type="spellEnd"/>
     </w:p>
     <w:p>
       <w:pPr>
@@ -1578,9 +1612,11 @@
           <w:numId w:val="1"/>
         </w:numPr>
       </w:pPr>
+      <w:proofErr w:type="spellStart"/>
       <w:r>
         <w:t>TypeScript</w:t>
       </w:r>
+      <w:proofErr w:type="spellEnd"/>
     </w:p>
     <w:p>
       <w:pPr>
@@ -1612,8 +1648,13 @@
           <w:numId w:val="2"/>
         </w:numPr>
       </w:pPr>
-      <w:r>
-        <w:t>jsonwebtoken (con @types)</w:t>
+      <w:proofErr w:type="spellStart"/>
+      <w:r>
+        <w:t>jsonwebtoken</w:t>
+      </w:r>
+      <w:proofErr w:type="spellEnd"/>
+      <w:r>
+        <w:t xml:space="preserve"> (con @types)</w:t>
       </w:r>
     </w:p>
     <w:p>
@@ -1624,8 +1665,13 @@
           <w:numId w:val="2"/>
         </w:numPr>
       </w:pPr>
-      <w:r>
-        <w:t>bcrypt (con @types)</w:t>
+      <w:proofErr w:type="spellStart"/>
+      <w:r>
+        <w:t>bcrypt</w:t>
+      </w:r>
+      <w:proofErr w:type="spellEnd"/>
+      <w:r>
+        <w:t xml:space="preserve"> (con @types)</w:t>
       </w:r>
     </w:p>
     <w:p>
@@ -1655,7 +1701,21 @@
         <w:rPr>
           <w:lang w:val="en-US"/>
         </w:rPr>
-        <w:t>connect-history-api-fallback (con @types)</w:t>
+        <w:t>connect-history-</w:t>
+      </w:r>
+      <w:proofErr w:type="spellStart"/>
+      <w:r>
+        <w:rPr>
+          <w:lang w:val="en-US"/>
+        </w:rPr>
+        <w:t>api</w:t>
+      </w:r>
+      <w:proofErr w:type="spellEnd"/>
+      <w:r>
+        <w:rPr>
+          <w:lang w:val="en-US"/>
+        </w:rPr>
+        <w:t>-fallback (con @types)</w:t>
       </w:r>
     </w:p>
     <w:p>
@@ -1666,9 +1726,11 @@
           <w:numId w:val="2"/>
         </w:numPr>
       </w:pPr>
+      <w:proofErr w:type="spellStart"/>
       <w:r>
         <w:t>dotenv</w:t>
       </w:r>
+      <w:proofErr w:type="spellEnd"/>
     </w:p>
     <w:p>
       <w:pPr>
@@ -1678,9 +1740,11 @@
           <w:numId w:val="2"/>
         </w:numPr>
       </w:pPr>
+      <w:proofErr w:type="spellStart"/>
       <w:r>
         <w:t>awesomephonenumber</w:t>
       </w:r>
+      <w:proofErr w:type="spellEnd"/>
     </w:p>
     <w:p>
       <w:pPr>
@@ -1708,7 +1772,21 @@
         <w:rPr>
           <w:lang w:val="en-US"/>
         </w:rPr>
-        <w:t>MEVN ( MySql, Express,  Vue, Node.js)</w:t>
+        <w:t xml:space="preserve">MEVN ( </w:t>
+      </w:r>
+      <w:proofErr w:type="spellStart"/>
+      <w:r>
+        <w:rPr>
+          <w:lang w:val="en-US"/>
+        </w:rPr>
+        <w:t>MySql</w:t>
+      </w:r>
+      <w:proofErr w:type="spellEnd"/>
+      <w:r>
+        <w:rPr>
+          <w:lang w:val="en-US"/>
+        </w:rPr>
+        <w:t>, Express,  Vue, Node.js)</w:t>
       </w:r>
     </w:p>
     <w:p>
@@ -1752,7 +1830,15 @@
         <w:t xml:space="preserve">Le istruzioni sono contenute nel readme.md </w:t>
       </w:r>
       <w:r>
-        <w:t>nella repository git del progetto.</w:t>
+        <w:t xml:space="preserve">nella repository </w:t>
+      </w:r>
+      <w:proofErr w:type="spellStart"/>
+      <w:r>
+        <w:t>git</w:t>
+      </w:r>
+      <w:proofErr w:type="spellEnd"/>
+      <w:r>
+        <w:t xml:space="preserve"> del progetto.</w:t>
       </w:r>
     </w:p>
     <w:p>
@@ -1800,8 +1886,13 @@
         </w:numPr>
       </w:pPr>
       <w:r>
-        <w:t>/api/admin/listAllEmployees</w:t>
-      </w:r>
+        <w:t>/api/admin/</w:t>
+      </w:r>
+      <w:proofErr w:type="spellStart"/>
+      <w:r>
+        <w:t>listAllEmployees</w:t>
+      </w:r>
+      <w:proofErr w:type="spellEnd"/>
     </w:p>
     <w:p>
       <w:pPr>
@@ -1812,8 +1903,13 @@
         </w:numPr>
       </w:pPr>
       <w:r>
-        <w:t>/api/admin/listWorkerEmployees</w:t>
-      </w:r>
+        <w:t>/api/admin/</w:t>
+      </w:r>
+      <w:proofErr w:type="spellStart"/>
+      <w:r>
+        <w:t>listWorkerEmployees</w:t>
+      </w:r>
+      <w:proofErr w:type="spellEnd"/>
     </w:p>
     <w:p>
       <w:pPr>
@@ -1824,8 +1920,21 @@
         </w:numPr>
       </w:pPr>
       <w:r>
-        <w:t>/api/auth/whoami</w:t>
-      </w:r>
+        <w:t>/api/</w:t>
+      </w:r>
+      <w:proofErr w:type="spellStart"/>
+      <w:r>
+        <w:t>auth</w:t>
+      </w:r>
+      <w:proofErr w:type="spellEnd"/>
+      <w:r>
+        <w:t>/</w:t>
+      </w:r>
+      <w:proofErr w:type="spellStart"/>
+      <w:r>
+        <w:t>whoami</w:t>
+      </w:r>
+      <w:proofErr w:type="spellEnd"/>
     </w:p>
     <w:p>
       <w:pPr>
@@ -1836,8 +1945,21 @@
         </w:numPr>
       </w:pPr>
       <w:r>
-        <w:t>/api/auth/whoamiCustomer</w:t>
-      </w:r>
+        <w:t>/api/</w:t>
+      </w:r>
+      <w:proofErr w:type="spellStart"/>
+      <w:r>
+        <w:t>auth</w:t>
+      </w:r>
+      <w:proofErr w:type="spellEnd"/>
+      <w:r>
+        <w:t>/</w:t>
+      </w:r>
+      <w:proofErr w:type="spellStart"/>
+      <w:r>
+        <w:t>whoamiCustomer</w:t>
+      </w:r>
+      <w:proofErr w:type="spellEnd"/>
     </w:p>
     <w:p>
       <w:pPr>
@@ -1848,7 +1970,15 @@
         </w:numPr>
       </w:pPr>
       <w:r>
-        <w:t>/api/auth/logout</w:t>
+        <w:t>/api/</w:t>
+      </w:r>
+      <w:proofErr w:type="spellStart"/>
+      <w:r>
+        <w:t>auth</w:t>
+      </w:r>
+      <w:proofErr w:type="spellEnd"/>
+      <w:r>
+        <w:t>/logout</w:t>
       </w:r>
     </w:p>
     <w:p>
@@ -1860,8 +1990,21 @@
         </w:numPr>
       </w:pPr>
       <w:r>
-        <w:t>/api/booking/checkDayAvailable/:yearMonth</w:t>
-      </w:r>
+        <w:t>/api/booking/</w:t>
+      </w:r>
+      <w:proofErr w:type="spellStart"/>
+      <w:r>
+        <w:t>checkDayAvailable</w:t>
+      </w:r>
+      <w:proofErr w:type="spellEnd"/>
+      <w:r>
+        <w:t>/:</w:t>
+      </w:r>
+      <w:proofErr w:type="spellStart"/>
+      <w:r>
+        <w:t>yearMonth</w:t>
+      </w:r>
+      <w:proofErr w:type="spellEnd"/>
     </w:p>
     <w:p>
       <w:pPr>
@@ -1872,8 +2015,13 @@
         </w:numPr>
       </w:pPr>
       <w:r>
-        <w:t>/api/booking/checkTimeAvailable</w:t>
-      </w:r>
+        <w:t>/api/booking/</w:t>
+      </w:r>
+      <w:proofErr w:type="spellStart"/>
+      <w:r>
+        <w:t>checkTimeAvailable</w:t>
+      </w:r>
+      <w:proofErr w:type="spellEnd"/>
     </w:p>
     <w:p>
       <w:pPr>
@@ -1884,8 +2032,13 @@
         </w:numPr>
       </w:pPr>
       <w:r>
-        <w:t>/api/customer/customerPage</w:t>
-      </w:r>
+        <w:t>/api/customer/</w:t>
+      </w:r>
+      <w:proofErr w:type="spellStart"/>
+      <w:r>
+        <w:t>customerPage</w:t>
+      </w:r>
+      <w:proofErr w:type="spellEnd"/>
     </w:p>
     <w:p>
       <w:pPr>
@@ -1896,8 +2049,21 @@
         </w:numPr>
       </w:pPr>
       <w:r>
-        <w:t>/api/customer/jobDetails/:jobId</w:t>
-      </w:r>
+        <w:t>/api/customer/</w:t>
+      </w:r>
+      <w:proofErr w:type="spellStart"/>
+      <w:r>
+        <w:t>jobDetails</w:t>
+      </w:r>
+      <w:proofErr w:type="spellEnd"/>
+      <w:r>
+        <w:t>/:</w:t>
+      </w:r>
+      <w:proofErr w:type="spellStart"/>
+      <w:r>
+        <w:t>jobId</w:t>
+      </w:r>
+      <w:proofErr w:type="spellEnd"/>
     </w:p>
     <w:p>
       <w:pPr>
@@ -1908,8 +2074,13 @@
         </w:numPr>
       </w:pPr>
       <w:r>
-        <w:t>/api/job/listAllJobs</w:t>
-      </w:r>
+        <w:t>/api/job/</w:t>
+      </w:r>
+      <w:proofErr w:type="spellStart"/>
+      <w:r>
+        <w:t>listAllJobs</w:t>
+      </w:r>
+      <w:proofErr w:type="spellEnd"/>
     </w:p>
     <w:p>
       <w:pPr>
@@ -1920,8 +2091,13 @@
         </w:numPr>
       </w:pPr>
       <w:r>
-        <w:t>/api/job/listEmployeeJobs</w:t>
-      </w:r>
+        <w:t>/api/job/</w:t>
+      </w:r>
+      <w:proofErr w:type="spellStart"/>
+      <w:r>
+        <w:t>listEmployeeJobs</w:t>
+      </w:r>
+      <w:proofErr w:type="spellEnd"/>
     </w:p>
     <w:p>
       <w:pPr>
@@ -1932,8 +2108,13 @@
         </w:numPr>
       </w:pPr>
       <w:r>
-        <w:t>/api/job/setStatusJobService</w:t>
-      </w:r>
+        <w:t>/api/job/</w:t>
+      </w:r>
+      <w:proofErr w:type="spellStart"/>
+      <w:r>
+        <w:t>setStatusJobService</w:t>
+      </w:r>
+      <w:proofErr w:type="spellEnd"/>
     </w:p>
     <w:p>
       <w:pPr>
@@ -1944,8 +2125,13 @@
         </w:numPr>
       </w:pPr>
       <w:r>
-        <w:t>/api/job/setEmployeeJobService</w:t>
-      </w:r>
+        <w:t>/api/job/</w:t>
+      </w:r>
+      <w:proofErr w:type="spellStart"/>
+      <w:r>
+        <w:t>setEmployeeJobService</w:t>
+      </w:r>
+      <w:proofErr w:type="spellEnd"/>
     </w:p>
     <w:p>
       <w:pPr>
@@ -1968,8 +2154,13 @@
         </w:numPr>
       </w:pPr>
       <w:r>
-        <w:t>/api/service/motorcycle</w:t>
-      </w:r>
+        <w:t>/api/service/</w:t>
+      </w:r>
+      <w:proofErr w:type="spellStart"/>
+      <w:r>
+        <w:t>motorcycle</w:t>
+      </w:r>
+      <w:proofErr w:type="spellEnd"/>
     </w:p>
     <w:p>
       <w:pPr>
@@ -1980,8 +2171,13 @@
         </w:numPr>
       </w:pPr>
       <w:r>
-        <w:t>/api/service/select</w:t>
-      </w:r>
+        <w:t>/api/service/</w:t>
+      </w:r>
+      <w:proofErr w:type="spellStart"/>
+      <w:r>
+        <w:t>select</w:t>
+      </w:r>
+      <w:proofErr w:type="spellEnd"/>
     </w:p>
     <w:p>
       <w:pPr>
@@ -2002,8 +2198,13 @@
         </w:numPr>
       </w:pPr>
       <w:r>
-        <w:t>/api/admin/setEmployeeJob</w:t>
-      </w:r>
+        <w:t>/api/admin/</w:t>
+      </w:r>
+      <w:proofErr w:type="spellStart"/>
+      <w:r>
+        <w:t>setEmployeeJob</w:t>
+      </w:r>
+      <w:proofErr w:type="spellEnd"/>
     </w:p>
     <w:p>
       <w:pPr>
@@ -2014,8 +2215,13 @@
         </w:numPr>
       </w:pPr>
       <w:r>
-        <w:t>/api/admin/unSetEmployeeJob</w:t>
-      </w:r>
+        <w:t>/api/admin/</w:t>
+      </w:r>
+      <w:proofErr w:type="spellStart"/>
+      <w:r>
+        <w:t>unSetEmployeeJob</w:t>
+      </w:r>
+      <w:proofErr w:type="spellEnd"/>
     </w:p>
     <w:p>
       <w:pPr>
@@ -2026,8 +2232,13 @@
         </w:numPr>
       </w:pPr>
       <w:r>
-        <w:t>/api/admin/registerEmployee</w:t>
-      </w:r>
+        <w:t>/api/admin/</w:t>
+      </w:r>
+      <w:proofErr w:type="spellStart"/>
+      <w:r>
+        <w:t>registerEmployee</w:t>
+      </w:r>
+      <w:proofErr w:type="spellEnd"/>
     </w:p>
     <w:p>
       <w:pPr>
@@ -2038,8 +2249,13 @@
         </w:numPr>
       </w:pPr>
       <w:r>
-        <w:t>/api/admin/removeEmployee</w:t>
-      </w:r>
+        <w:t>/api/admin/</w:t>
+      </w:r>
+      <w:proofErr w:type="spellStart"/>
+      <w:r>
+        <w:t>removeEmployee</w:t>
+      </w:r>
+      <w:proofErr w:type="spellEnd"/>
     </w:p>
     <w:p>
       <w:pPr>
@@ -2050,8 +2266,21 @@
         </w:numPr>
       </w:pPr>
       <w:r>
-        <w:t>/api/auth/registerCustomer</w:t>
-      </w:r>
+        <w:t>/api/</w:t>
+      </w:r>
+      <w:proofErr w:type="spellStart"/>
+      <w:r>
+        <w:t>auth</w:t>
+      </w:r>
+      <w:proofErr w:type="spellEnd"/>
+      <w:r>
+        <w:t>/</w:t>
+      </w:r>
+      <w:proofErr w:type="spellStart"/>
+      <w:r>
+        <w:t>registerCustomer</w:t>
+      </w:r>
+      <w:proofErr w:type="spellEnd"/>
     </w:p>
     <w:p>
       <w:pPr>
@@ -2062,8 +2291,21 @@
         </w:numPr>
       </w:pPr>
       <w:r>
-        <w:t>/api/auth/loginCustomer</w:t>
-      </w:r>
+        <w:t>/api/</w:t>
+      </w:r>
+      <w:proofErr w:type="spellStart"/>
+      <w:r>
+        <w:t>auth</w:t>
+      </w:r>
+      <w:proofErr w:type="spellEnd"/>
+      <w:r>
+        <w:t>/</w:t>
+      </w:r>
+      <w:proofErr w:type="spellStart"/>
+      <w:r>
+        <w:t>loginCustomer</w:t>
+      </w:r>
+      <w:proofErr w:type="spellEnd"/>
     </w:p>
     <w:p>
       <w:pPr>
@@ -2074,8 +2316,21 @@
         </w:numPr>
       </w:pPr>
       <w:r>
-        <w:t>/api/auth/loginEmployee</w:t>
-      </w:r>
+        <w:t>/api/</w:t>
+      </w:r>
+      <w:proofErr w:type="spellStart"/>
+      <w:r>
+        <w:t>auth</w:t>
+      </w:r>
+      <w:proofErr w:type="spellEnd"/>
+      <w:r>
+        <w:t>/</w:t>
+      </w:r>
+      <w:proofErr w:type="spellStart"/>
+      <w:r>
+        <w:t>loginEmployee</w:t>
+      </w:r>
+      <w:proofErr w:type="spellEnd"/>
     </w:p>
     <w:p>
       <w:pPr>
@@ -2086,8 +2341,13 @@
         </w:numPr>
       </w:pPr>
       <w:r>
-        <w:t>/api/booking/saveBooking</w:t>
-      </w:r>
+        <w:t>/api/booking/</w:t>
+      </w:r>
+      <w:proofErr w:type="spellStart"/>
+      <w:r>
+        <w:t>saveBooking</w:t>
+      </w:r>
+      <w:proofErr w:type="spellEnd"/>
     </w:p>
     <w:p>
       <w:pPr>
@@ -2108,8 +2368,21 @@
         </w:numPr>
       </w:pPr>
       <w:r>
-        <w:t>/api/customer/jobDelete/:jobId</w:t>
-      </w:r>
+        <w:t>/api/customer/</w:t>
+      </w:r>
+      <w:proofErr w:type="spellStart"/>
+      <w:r>
+        <w:t>jobDelete</w:t>
+      </w:r>
+      <w:proofErr w:type="spellEnd"/>
+      <w:r>
+        <w:t>/:</w:t>
+      </w:r>
+      <w:proofErr w:type="spellStart"/>
+      <w:r>
+        <w:t>jobId</w:t>
+      </w:r>
+      <w:proofErr w:type="spellEnd"/>
     </w:p>
     <w:p>
       <w:r>
@@ -2137,8 +2410,72 @@
         <w:rPr>
           <w:lang w:val="en-US"/>
         </w:rPr>
-        <w:t>Query di creazione database situata in ./EngineCheckProject/backend/sql/EngineCheck.sql</w:t>
-      </w:r>
+        <w:t xml:space="preserve">Query di </w:t>
+      </w:r>
+      <w:proofErr w:type="spellStart"/>
+      <w:r>
+        <w:rPr>
+          <w:lang w:val="en-US"/>
+        </w:rPr>
+        <w:t>creazione</w:t>
+      </w:r>
+      <w:proofErr w:type="spellEnd"/>
+      <w:r>
+        <w:rPr>
+          <w:lang w:val="en-US"/>
+        </w:rPr>
+        <w:t xml:space="preserve"> database </w:t>
+      </w:r>
+      <w:proofErr w:type="spellStart"/>
+      <w:r>
+        <w:rPr>
+          <w:lang w:val="en-US"/>
+        </w:rPr>
+        <w:t>situata</w:t>
+      </w:r>
+      <w:proofErr w:type="spellEnd"/>
+      <w:r>
+        <w:rPr>
+          <w:lang w:val="en-US"/>
+        </w:rPr>
+        <w:t xml:space="preserve"> in ./</w:t>
+      </w:r>
+      <w:proofErr w:type="spellStart"/>
+      <w:r>
+        <w:rPr>
+          <w:lang w:val="en-US"/>
+        </w:rPr>
+        <w:t>EngineCheckProject</w:t>
+      </w:r>
+      <w:proofErr w:type="spellEnd"/>
+      <w:r>
+        <w:rPr>
+          <w:lang w:val="en-US"/>
+        </w:rPr>
+        <w:t>/backend/</w:t>
+      </w:r>
+      <w:proofErr w:type="spellStart"/>
+      <w:r>
+        <w:rPr>
+          <w:lang w:val="en-US"/>
+        </w:rPr>
+        <w:t>sql</w:t>
+      </w:r>
+      <w:proofErr w:type="spellEnd"/>
+      <w:r>
+        <w:rPr>
+          <w:lang w:val="en-US"/>
+        </w:rPr>
+        <w:t>/</w:t>
+      </w:r>
+      <w:proofErr w:type="spellStart"/>
+      <w:r>
+        <w:rPr>
+          <w:lang w:val="en-US"/>
+        </w:rPr>
+        <w:t>EngineCheck.sql</w:t>
+      </w:r>
+      <w:proofErr w:type="spellEnd"/>
       <w:r>
         <w:rPr>
           <w:lang w:val="en-US"/>
@@ -2161,7 +2498,42 @@
         <w:rPr>
           <w:lang w:val="en-US"/>
         </w:rPr>
-        <w:t>./EngineCheckProject/backend/sql/EngineCheck</w:t>
+        <w:t>./</w:t>
+      </w:r>
+      <w:proofErr w:type="spellStart"/>
+      <w:r>
+        <w:rPr>
+          <w:lang w:val="en-US"/>
+        </w:rPr>
+        <w:t>EngineCheckProject</w:t>
+      </w:r>
+      <w:proofErr w:type="spellEnd"/>
+      <w:r>
+        <w:rPr>
+          <w:lang w:val="en-US"/>
+        </w:rPr>
+        <w:t>/backend/</w:t>
+      </w:r>
+      <w:proofErr w:type="spellStart"/>
+      <w:r>
+        <w:rPr>
+          <w:lang w:val="en-US"/>
+        </w:rPr>
+        <w:t>sql</w:t>
+      </w:r>
+      <w:proofErr w:type="spellEnd"/>
+      <w:r>
+        <w:rPr>
+          <w:lang w:val="en-US"/>
+        </w:rPr>
+        <w:t>/</w:t>
+      </w:r>
+      <w:proofErr w:type="spellStart"/>
+      <w:r>
+        <w:rPr>
+          <w:lang w:val="en-US"/>
+        </w:rPr>
+        <w:t>EngineCheck</w:t>
       </w:r>
       <w:r>
         <w:rPr>
@@ -2175,6 +2547,7 @@
         </w:rPr>
         <w:t>.sql</w:t>
       </w:r>
+      <w:proofErr w:type="spellEnd"/>
     </w:p>
     <w:p>
       <w:r>
@@ -2227,8 +2600,13 @@
         <w:pStyle w:val="Titolo1"/>
       </w:pPr>
       <w:bookmarkStart w:id="15" w:name="_Toc231639402"/>
-      <w:r>
-        <w:t>Mockup iniziale</w:t>
+      <w:proofErr w:type="spellStart"/>
+      <w:r>
+        <w:t>Mockup</w:t>
+      </w:r>
+      <w:proofErr w:type="spellEnd"/>
+      <w:r>
+        <w:t xml:space="preserve"> iniziale</w:t>
       </w:r>
       <w:bookmarkEnd w:id="15"/>
     </w:p>
@@ -2242,7 +2620,21 @@
         <w:rPr>
           <w:lang w:val="en-US"/>
         </w:rPr>
-        <w:t>Link figma: https://www.figma.com/design/a2vk6vfzNOL8sqM5RMt5GV/Progetto-web?node-id=0-1&amp;t=eUldEwrBRyvkYhQ7-1</w:t>
+        <w:t xml:space="preserve">Link </w:t>
+      </w:r>
+      <w:proofErr w:type="spellStart"/>
+      <w:r>
+        <w:rPr>
+          <w:lang w:val="en-US"/>
+        </w:rPr>
+        <w:t>figma</w:t>
+      </w:r>
+      <w:proofErr w:type="spellEnd"/>
+      <w:r>
+        <w:rPr>
+          <w:lang w:val="en-US"/>
+        </w:rPr>
+        <w:t>: https://www.figma.com/design/a2vk6vfzNOL8sqM5RMt5GV/Progetto-web?node-id=0-1&amp;t=eUldEwrBRyvkYhQ7-1</w:t>
       </w:r>
     </w:p>
     <w:p>
@@ -2272,6 +2664,146 @@
 <file path=word/numbering.xml><?xml version="1.0" encoding="utf-8"?>
 <w:numbering xmlns:wpc="http://schemas.microsoft.com/office/word/2010/wordprocessingCanvas" xmlns:cx="http://schemas.microsoft.com/office/drawing/2014/chartex" xmlns:cx1="http://schemas.microsoft.com/office/drawing/2015/9/8/chartex" xmlns:cx2="http://schemas.microsoft.com/office/drawing/2015/10/21/chartex" xmlns:cx3="http://schemas.microsoft.com/office/drawing/2016/5/9/chartex" xmlns:cx4="http://schemas.microsoft.com/office/drawing/2016/5/10/chartex" xmlns:cx5="http://schemas.microsoft.com/office/drawing/2016/5/11/chartex" xmlns:cx6="http://schemas.microsoft.com/office/drawing/2016/5/12/chartex" xmlns:cx7="http://schemas.microsoft.com/office/drawing/2016/5/13/chartex" xmlns:cx8="http://schemas.microsoft.com/office/drawing/2016/5/14/chartex" xmlns:mc="http://schemas.openxmlformats.org/markup-compatibility/2006" xmlns:aink="http://schemas.microsoft.com/office/drawing/2016/ink" xmlns:am3d="http://schemas.microsoft.com/office/drawing/2017/model3d" xmlns:o="urn:schemas-microsoft-com:office:office" xmlns:oel="http://schemas.microsoft.com/office/2019/extlst" xmlns:r="http://schemas.openxmlformats.org/officeDocument/2006/relationships" xmlns:m="http://schemas.openxmlformats.org/officeDocument/2006/math" xmlns:v="urn:schemas-microsoft-com:vml" xmlns:wp14="http://schemas.microsoft.com/office/word/2010/wordprocessingDrawing" xmlns:wp="http://schemas.openxmlformats.org/drawingml/2006/wordprocessingDrawing" xmlns:w10="urn:schemas-microsoft-com:office:word" xmlns:w="http://schemas.openxmlformats.org/wordprocessingml/2006/main" xmlns:w14="http://schemas.microsoft.com/office/word/2010/wordml" xmlns:w15="http://schemas.microsoft.com/office/word/2012/wordml" xmlns:w16cex="http://schemas.microsoft.com/office/word/2018/wordml/cex" xmlns:w16cid="http://schemas.microsoft.com/office/word/2016/wordml/cid" xmlns:w16="http://schemas.microsoft.com/office/word/2018/wordml" xmlns:w16du="http://schemas.microsoft.com/office/word/2023/wordml/word16du" xmlns:w16sdtdh="http://schemas.microsoft.com/office/word/2020/wordml/sdtdatahash" xmlns:w16sdtfl="http://schemas.microsoft.com/office/word/2024/wordml/sdtformatlock" xmlns:w16se="http://schemas.microsoft.com/office/word/2015/wordml/symex" xmlns:wpg="http://schemas.microsoft.com/office/word/2010/wordprocessingGroup" xmlns:wpi="http://schemas.microsoft.com/office/word/2010/wordprocessingInk" xmlns:wne="http://schemas.microsoft.com/office/word/2006/wordml" xmlns:wps="http://schemas.microsoft.com/office/word/2010/wordprocessingShape" mc:Ignorable="w14 w15 w16se w16cid w16 w16cex w16sdtdh w16sdtfl w16du wp14">
   <w:abstractNum w:abstractNumId="0" w15:restartNumberingAfterBreak="0">
+    <w:nsid w:val="0AED6333"/>
+    <w:multiLevelType w:val="hybridMultilevel"/>
+    <w:tmpl w:val="BE7E9CFC"/>
+    <w:lvl w:ilvl="0" w:tplc="EBEE9C9E">
+      <w:start w:val="1"/>
+      <w:numFmt w:val="bullet"/>
+      <w:lvlText w:val="•"/>
+      <w:lvlJc w:val="left"/>
+      <w:pPr>
+        <w:tabs>
+          <w:tab w:val="num" w:pos="720"/>
+        </w:tabs>
+        <w:ind w:left="720" w:hanging="360"/>
+      </w:pPr>
+      <w:rPr>
+        <w:rFonts w:ascii="Arial" w:hAnsi="Arial" w:hint="default"/>
+      </w:rPr>
+    </w:lvl>
+    <w:lvl w:ilvl="1" w:tplc="C666B3EE" w:tentative="1">
+      <w:start w:val="1"/>
+      <w:numFmt w:val="bullet"/>
+      <w:lvlText w:val="•"/>
+      <w:lvlJc w:val="left"/>
+      <w:pPr>
+        <w:tabs>
+          <w:tab w:val="num" w:pos="1440"/>
+        </w:tabs>
+        <w:ind w:left="1440" w:hanging="360"/>
+      </w:pPr>
+      <w:rPr>
+        <w:rFonts w:ascii="Arial" w:hAnsi="Arial" w:hint="default"/>
+      </w:rPr>
+    </w:lvl>
+    <w:lvl w:ilvl="2" w:tplc="56EC1A0A" w:tentative="1">
+      <w:start w:val="1"/>
+      <w:numFmt w:val="bullet"/>
+      <w:lvlText w:val="•"/>
+      <w:lvlJc w:val="left"/>
+      <w:pPr>
+        <w:tabs>
+          <w:tab w:val="num" w:pos="2160"/>
+        </w:tabs>
+        <w:ind w:left="2160" w:hanging="360"/>
+      </w:pPr>
+      <w:rPr>
+        <w:rFonts w:ascii="Arial" w:hAnsi="Arial" w:hint="default"/>
+      </w:rPr>
+    </w:lvl>
+    <w:lvl w:ilvl="3" w:tplc="4686EA5E" w:tentative="1">
+      <w:start w:val="1"/>
+      <w:numFmt w:val="bullet"/>
+      <w:lvlText w:val="•"/>
+      <w:lvlJc w:val="left"/>
+      <w:pPr>
+        <w:tabs>
+          <w:tab w:val="num" w:pos="2880"/>
+        </w:tabs>
+        <w:ind w:left="2880" w:hanging="360"/>
+      </w:pPr>
+      <w:rPr>
+        <w:rFonts w:ascii="Arial" w:hAnsi="Arial" w:hint="default"/>
+      </w:rPr>
+    </w:lvl>
+    <w:lvl w:ilvl="4" w:tplc="DC2652C0" w:tentative="1">
+      <w:start w:val="1"/>
+      <w:numFmt w:val="bullet"/>
+      <w:lvlText w:val="•"/>
+      <w:lvlJc w:val="left"/>
+      <w:pPr>
+        <w:tabs>
+          <w:tab w:val="num" w:pos="3600"/>
+        </w:tabs>
+        <w:ind w:left="3600" w:hanging="360"/>
+      </w:pPr>
+      <w:rPr>
+        <w:rFonts w:ascii="Arial" w:hAnsi="Arial" w:hint="default"/>
+      </w:rPr>
+    </w:lvl>
+    <w:lvl w:ilvl="5" w:tplc="FFE6DA88" w:tentative="1">
+      <w:start w:val="1"/>
+      <w:numFmt w:val="bullet"/>
+      <w:lvlText w:val="•"/>
+      <w:lvlJc w:val="left"/>
+      <w:pPr>
+        <w:tabs>
+          <w:tab w:val="num" w:pos="4320"/>
+        </w:tabs>
+        <w:ind w:left="4320" w:hanging="360"/>
+      </w:pPr>
+      <w:rPr>
+        <w:rFonts w:ascii="Arial" w:hAnsi="Arial" w:hint="default"/>
+      </w:rPr>
+    </w:lvl>
+    <w:lvl w:ilvl="6" w:tplc="457CF5BC" w:tentative="1">
+      <w:start w:val="1"/>
+      <w:numFmt w:val="bullet"/>
+      <w:lvlText w:val="•"/>
+      <w:lvlJc w:val="left"/>
+      <w:pPr>
+        <w:tabs>
+          <w:tab w:val="num" w:pos="5040"/>
+        </w:tabs>
+        <w:ind w:left="5040" w:hanging="360"/>
+      </w:pPr>
+      <w:rPr>
+        <w:rFonts w:ascii="Arial" w:hAnsi="Arial" w:hint="default"/>
+      </w:rPr>
+    </w:lvl>
+    <w:lvl w:ilvl="7" w:tplc="C0D2D7FE" w:tentative="1">
+      <w:start w:val="1"/>
+      <w:numFmt w:val="bullet"/>
+      <w:lvlText w:val="•"/>
+      <w:lvlJc w:val="left"/>
+      <w:pPr>
+        <w:tabs>
+          <w:tab w:val="num" w:pos="5760"/>
+        </w:tabs>
+        <w:ind w:left="5760" w:hanging="360"/>
+      </w:pPr>
+      <w:rPr>
+        <w:rFonts w:ascii="Arial" w:hAnsi="Arial" w:hint="default"/>
+      </w:rPr>
+    </w:lvl>
+    <w:lvl w:ilvl="8" w:tplc="A740B2D2" w:tentative="1">
+      <w:start w:val="1"/>
+      <w:numFmt w:val="bullet"/>
+      <w:lvlText w:val="•"/>
+      <w:lvlJc w:val="left"/>
+      <w:pPr>
+        <w:tabs>
+          <w:tab w:val="num" w:pos="6480"/>
+        </w:tabs>
+        <w:ind w:left="6480" w:hanging="360"/>
+      </w:pPr>
+      <w:rPr>
+        <w:rFonts w:ascii="Arial" w:hAnsi="Arial" w:hint="default"/>
+      </w:rPr>
+    </w:lvl>
+  </w:abstractNum>
+  <w:abstractNum w:abstractNumId="1" w15:restartNumberingAfterBreak="0">
     <w:nsid w:val="17A60326"/>
     <w:multiLevelType w:val="hybridMultilevel"/>
     <w:tmpl w:val="F0F2F2A8"/>
@@ -2384,7 +2916,7 @@
       </w:rPr>
     </w:lvl>
   </w:abstractNum>
-  <w:abstractNum w:abstractNumId="1" w15:restartNumberingAfterBreak="0">
+  <w:abstractNum w:abstractNumId="2" w15:restartNumberingAfterBreak="0">
     <w:nsid w:val="1D184C4A"/>
     <w:multiLevelType w:val="hybridMultilevel"/>
     <w:tmpl w:val="D51C382E"/>
@@ -2497,7 +3029,7 @@
       </w:rPr>
     </w:lvl>
   </w:abstractNum>
-  <w:abstractNum w:abstractNumId="2" w15:restartNumberingAfterBreak="0">
+  <w:abstractNum w:abstractNumId="3" w15:restartNumberingAfterBreak="0">
     <w:nsid w:val="6AE518F6"/>
     <w:multiLevelType w:val="hybridMultilevel"/>
     <w:tmpl w:val="ABC06CD0"/>
@@ -2610,7 +3142,7 @@
       </w:rPr>
     </w:lvl>
   </w:abstractNum>
-  <w:abstractNum w:abstractNumId="3" w15:restartNumberingAfterBreak="0">
+  <w:abstractNum w:abstractNumId="4" w15:restartNumberingAfterBreak="0">
     <w:nsid w:val="7F721455"/>
     <w:multiLevelType w:val="hybridMultilevel"/>
     <w:tmpl w:val="8C529BF0"/>
@@ -2724,16 +3256,19 @@
     </w:lvl>
   </w:abstractNum>
   <w:num w:numId="1" w16cid:durableId="721170845">
+    <w:abstractNumId w:val="4"/>
+  </w:num>
+  <w:num w:numId="2" w16cid:durableId="1324771341">
+    <w:abstractNumId w:val="1"/>
+  </w:num>
+  <w:num w:numId="3" w16cid:durableId="1960918919">
     <w:abstractNumId w:val="3"/>
   </w:num>
-  <w:num w:numId="2" w16cid:durableId="1324771341">
-    <w:abstractNumId w:val="0"/>
-  </w:num>
-  <w:num w:numId="3" w16cid:durableId="1960918919">
+  <w:num w:numId="4" w16cid:durableId="1340431486">
     <w:abstractNumId w:val="2"/>
   </w:num>
-  <w:num w:numId="4" w16cid:durableId="1340431486">
-    <w:abstractNumId w:val="1"/>
+  <w:num w:numId="5" w16cid:durableId="1784643234">
+    <w:abstractNumId w:val="0"/>
   </w:num>
 </w:numbering>
 </file>
@@ -3341,7 +3876,6 @@
   <w:style w:type="character" w:default="1" w:styleId="Carpredefinitoparagrafo">
     <w:name w:val="Default Paragraph Font"/>
     <w:uiPriority w:val="1"/>
-    <w:semiHidden/>
     <w:unhideWhenUsed/>
   </w:style>
   <w:style w:type="table" w:default="1" w:styleId="Tabellanormale">

</xml_diff>